<commit_message>
updated timeline and resumes
</commit_message>
<xml_diff>
--- a/public/ResumeMalachiRosarioSwe.docx
+++ b/public/ResumeMalachiRosarioSwe.docx
@@ -206,7 +206,7 @@
         <w:rPr>
           <w:rFonts w:ascii="Times New Roman" w:hAnsi="Times New Roman" w:cs="Times New Roman"/>
         </w:rPr>
-        <w:t>Current</w:t>
+        <w:t>05/2026</w:t>
       </w:r>
     </w:p>
     <w:p>
@@ -329,13 +329,7 @@
         <w:rPr>
           <w:rFonts w:ascii="Times New Roman" w:hAnsi="Times New Roman" w:cs="Times New Roman"/>
         </w:rPr>
-        <w:t>Parallel and Distributed Computing</w:t>
-      </w:r>
-      <w:r>
-        <w:rPr>
-          <w:rFonts w:ascii="Times New Roman" w:hAnsi="Times New Roman" w:cs="Times New Roman"/>
-        </w:rPr>
-        <w:t xml:space="preserve"> | </w:t>
+        <w:t xml:space="preserve">Parallel and Distributed Computing | </w:t>
       </w:r>
       <w:r>
         <w:rPr>
@@ -365,19 +359,7 @@
         <w:rPr>
           <w:rFonts w:ascii="Times New Roman" w:hAnsi="Times New Roman" w:cs="Times New Roman"/>
         </w:rPr>
-        <w:t xml:space="preserve"> </w:t>
-      </w:r>
-      <w:r>
-        <w:rPr>
-          <w:rFonts w:ascii="Times New Roman" w:hAnsi="Times New Roman" w:cs="Times New Roman"/>
-        </w:rPr>
-        <w:t>| Data Science | Artificial Intelligence</w:t>
-      </w:r>
-      <w:r>
-        <w:rPr>
-          <w:rFonts w:ascii="Times New Roman" w:hAnsi="Times New Roman" w:cs="Times New Roman"/>
-        </w:rPr>
-        <w:t xml:space="preserve"> </w:t>
+        <w:t xml:space="preserve"> | Data Science | Artificial Intelligence </w:t>
       </w:r>
       <w:r>
         <w:rPr>
@@ -2437,19 +2419,7 @@
         <w:rPr>
           <w:rFonts w:ascii="Times New Roman" w:hAnsi="Times New Roman" w:cs="Times New Roman"/>
         </w:rPr>
-        <w:t>Architected a distributed producer</w:t>
-      </w:r>
-      <w:r>
-        <w:rPr>
-          <w:rFonts w:ascii="Times New Roman" w:hAnsi="Times New Roman" w:cs="Times New Roman"/>
-        </w:rPr>
-        <w:t>/</w:t>
-      </w:r>
-      <w:r>
-        <w:rPr>
-          <w:rFonts w:ascii="Times New Roman" w:hAnsi="Times New Roman" w:cs="Times New Roman"/>
-        </w:rPr>
-        <w:t xml:space="preserve">consumer streaming workflow </w:t>
+        <w:t xml:space="preserve">Architected a distributed producer/consumer streaming workflow </w:t>
       </w:r>
       <w:r>
         <w:rPr>

</xml_diff>